<commit_message>
docs(paper): feasibility-led title + aligned abstract opening
Retitle to "Feasibility of a Transfer-Entropy Firewall Signature for Blade-Pitch
Controller Health Monitoring in Floating Offshore Wind Turbines" (Title paragraph
+ dc:title). Add an aim sentence to the abstract opening so the feasibility
framing leads while the demonstrated firewall stays the basis. No overclaim: the
"motivated outlook, not a method" sentence is unchanged.

Co-Authored-By: Claude Opus 4.8 <noreply@anthropic.com>
</commit_message>
<xml_diff>
--- a/reports/te-firewall-paper.docx
+++ b/reports/te-firewall-paper.docx
@@ -7,7 +7,7 @@
         <w:pStyle w:val="Title"/>
       </w:pPr>
       <w:r>
-        <w:t>An Information-Theoretic Firewall in Floating Offshore Wind Turbines: Feasibility for Blade-Pitch Controller Health Monitoring</w:t>
+        <w:t>Feasibility of a Transfer-Entropy Firewall Signature for Blade-Pitch Controller Health Monitoring in Floating Offshore Wind Turbines</w:t>
       </w:r>
     </w:p>
     <w:p>
@@ -50,7 +50,7 @@
         <w:t>direction</w:t>
       </w:r>
       <w:r>
-        <w:t xml:space="preserve"> of influence, and reveal nothing about whether the controller works. In a healthy FOWT the blade-pitch controller is shown to act as an information </w:t>
+        <w:t xml:space="preserve"> of influence, and reveal nothing about whether the controller works. This study assesses the feasibility of using directed information flow — transfer entropy from wind into platform motion — to monitor blade-pitch controller health. In a healthy FOWT the blade-pitch controller is shown to act as an information </w:t>
       </w:r>
       <w:r>
         <w:rPr>

</xml_diff>